<commit_message>
feat: Introduce new features
</commit_message>
<xml_diff>
--- a/docs/南京-杭天铖-2026-06-11-计算机网络拥塞控制.docx
+++ b/docs/南京-杭天铖-2026-06-11-计算机网络拥塞控制.docx
@@ -309,7 +309,11 @@
         <w:t>版本以来的默认拥塞控制算法，它采用三次函数模型调整窗口大小，通过距离上次拥塞事件的时间来计算窗口增长曲线，在高带宽延迟积（</w:t>
       </w:r>
       <w:r>
-        <w:t>Bandwidth-Delay Product</w:t>
+        <w:t xml:space="preserve">Bandwidth-Delay </w:t>
+      </w:r>
+      <w:proofErr w:type="spellStart"/>
+      <w:r>
+        <w:t>Product</w:t>
       </w:r>
       <w:r>
         <w:t>，</w:t>
@@ -318,11 +322,7 @@
         <w:t>BDP</w:t>
       </w:r>
       <w:r>
-        <w:t>）</w:t>
-      </w:r>
-      <w:proofErr w:type="spellStart"/>
-      <w:r>
-        <w:t>网络中具有更快的收敛速度</w:t>
+        <w:t>）网络中具有更快的收敛速度</w:t>
       </w:r>
       <w:proofErr w:type="spellEnd"/>
       <w:r>
@@ -783,17 +783,28 @@
       <w:r>
         <w:t xml:space="preserve"> IP </w:t>
       </w:r>
+      <w:proofErr w:type="spellStart"/>
       <w:r>
         <w:t>报头的</w:t>
       </w:r>
+      <w:proofErr w:type="spellEnd"/>
       <w:r>
         <w:t xml:space="preserve"> ECN </w:t>
       </w:r>
+      <w:proofErr w:type="spellStart"/>
       <w:r>
         <w:t>字段中设置拥塞经历（</w:t>
       </w:r>
       <w:r>
-        <w:t>Congestion Experienced</w:t>
+        <w:t>Congestion</w:t>
+      </w:r>
+      <w:proofErr w:type="spellEnd"/>
+      <w:r>
+        <w:t xml:space="preserve"> </w:t>
+      </w:r>
+      <w:proofErr w:type="spellStart"/>
+      <w:r>
+        <w:t>Experienced</w:t>
       </w:r>
       <w:r>
         <w:t>，</w:t>
@@ -802,11 +813,7 @@
         <w:t>CE</w:t>
       </w:r>
       <w:r>
-        <w:t>）</w:t>
-      </w:r>
-      <w:proofErr w:type="spellStart"/>
-      <w:r>
-        <w:t>标记，而不是直接丢弃数据包</w:t>
+        <w:t>）标记，而不是直接丢弃数据包</w:t>
       </w:r>
       <w:proofErr w:type="spellEnd"/>
       <w:r>
@@ -1363,6 +1370,7 @@
             <m:r>
               <w:rPr>
                 <w:rFonts w:ascii="Cambria Math" w:hAnsi="Cambria Math"/>
+                <w:lang w:eastAsia="zh-CN"/>
               </w:rPr>
               <m:t>W</m:t>
             </m:r>
@@ -1371,6 +1379,7 @@
             <m:r>
               <w:rPr>
                 <w:rFonts w:ascii="Cambria Math" w:hAnsi="Cambria Math"/>
+                <w:lang w:eastAsia="zh-CN"/>
               </w:rPr>
               <m:t>bw</m:t>
             </m:r>
@@ -2132,6 +2141,7 @@
             <m:r>
               <w:rPr>
                 <w:rFonts w:ascii="Cambria Math" w:hAnsi="Cambria Math"/>
+                <w:lang w:eastAsia="zh-CN"/>
               </w:rPr>
               <m:t>n</m:t>
             </m:r>
@@ -2140,6 +2150,7 @@
             <m:r>
               <w:rPr>
                 <w:rFonts w:ascii="Cambria Math" w:hAnsi="Cambria Math"/>
+                <w:lang w:eastAsia="zh-CN"/>
               </w:rPr>
               <m:t>ack</m:t>
             </m:r>
@@ -3251,14 +3262,15 @@
       <w:pPr>
         <w:spacing w:after="0" w:line="360" w:lineRule="auto"/>
         <w:ind w:firstLine="420"/>
-      </w:pPr>
-      <w:proofErr w:type="spellStart"/>
-      <w:r>
-        <w:t>吞吐量指数移动平均</w:t>
-      </w:r>
-      <w:proofErr w:type="spellEnd"/>
-      <w:r>
-        <w:t>：</w:t>
+        <w:rPr>
+          <w:lang w:eastAsia="zh-CN"/>
+        </w:rPr>
+      </w:pPr>
+      <w:r>
+        <w:rPr>
+          <w:lang w:eastAsia="zh-CN"/>
+        </w:rPr>
+        <w:t>吞吐量指数移动平均：</w:t>
       </w:r>
       <m:oMath>
         <m:sSub>
@@ -3283,6 +3295,7 @@
                 <m:r>
                   <w:rPr>
                     <w:rFonts w:ascii="Cambria Math" w:hAnsi="Cambria Math"/>
+                    <w:lang w:eastAsia="zh-CN"/>
                   </w:rPr>
                   <m:t>R</m:t>
                 </m:r>
@@ -3293,6 +3306,7 @@
             <m:r>
               <w:rPr>
                 <w:rFonts w:ascii="Cambria Math" w:hAnsi="Cambria Math"/>
+                <w:lang w:eastAsia="zh-CN"/>
               </w:rPr>
               <m:t>t</m:t>
             </m:r>
@@ -3301,6 +3315,7 @@
         <m:r>
           <w:rPr>
             <w:rFonts w:ascii="Cambria Math" w:hAnsi="Cambria Math"/>
+            <w:lang w:eastAsia="zh-CN"/>
           </w:rPr>
           <m:t>=0.9×</m:t>
         </m:r>
@@ -3326,6 +3341,7 @@
                 <m:r>
                   <w:rPr>
                     <w:rFonts w:ascii="Cambria Math" w:hAnsi="Cambria Math"/>
+                    <w:lang w:eastAsia="zh-CN"/>
                   </w:rPr>
                   <m:t>R</m:t>
                 </m:r>
@@ -3336,6 +3352,7 @@
             <m:r>
               <w:rPr>
                 <w:rFonts w:ascii="Cambria Math" w:hAnsi="Cambria Math"/>
+                <w:lang w:eastAsia="zh-CN"/>
               </w:rPr>
               <m:t>t-1</m:t>
             </m:r>
@@ -3344,6 +3361,7 @@
         <m:r>
           <w:rPr>
             <w:rFonts w:ascii="Cambria Math" w:hAnsi="Cambria Math"/>
+            <w:lang w:eastAsia="zh-CN"/>
           </w:rPr>
           <m:t>+0.1×</m:t>
         </m:r>
@@ -3359,6 +3377,7 @@
             <m:r>
               <w:rPr>
                 <w:rFonts w:ascii="Cambria Math" w:hAnsi="Cambria Math"/>
+                <w:lang w:eastAsia="zh-CN"/>
               </w:rPr>
               <m:t>R</m:t>
             </m:r>
@@ -3367,6 +3386,7 @@
             <m:r>
               <w:rPr>
                 <w:rFonts w:ascii="Cambria Math" w:hAnsi="Cambria Math"/>
+                <w:lang w:eastAsia="zh-CN"/>
               </w:rPr>
               <m:t>delivery</m:t>
             </m:r>
@@ -3374,6 +3394,9 @@
         </m:sSub>
       </m:oMath>
       <w:r>
+        <w:rPr>
+          <w:lang w:eastAsia="zh-CN"/>
+        </w:rPr>
         <w:t>，首次初始化为第一个有效交付速率值。</w:t>
       </w:r>
     </w:p>
@@ -4068,6 +4091,7 @@
                 <m:r>
                   <w:rPr>
                     <w:rFonts w:ascii="Cambria Math" w:hAnsi="Cambria Math"/>
+                    <w:lang w:eastAsia="zh-CN"/>
                   </w:rPr>
                   <m:t>R</m:t>
                 </m:r>
@@ -4078,6 +4102,7 @@
             <m:r>
               <w:rPr>
                 <w:rFonts w:ascii="Cambria Math" w:hAnsi="Cambria Math"/>
+                <w:lang w:eastAsia="zh-CN"/>
               </w:rPr>
               <m:t>ema</m:t>
             </m:r>
@@ -4125,6 +4150,7 @@
                 <m:r>
                   <w:rPr>
                     <w:rFonts w:ascii="Cambria Math" w:hAnsi="Cambria Math"/>
+                    <w:lang w:eastAsia="zh-CN"/>
                   </w:rPr>
                   <m:t>R</m:t>
                 </m:r>
@@ -4135,6 +4161,7 @@
             <m:r>
               <w:rPr>
                 <w:rFonts w:ascii="Cambria Math" w:hAnsi="Cambria Math"/>
+                <w:lang w:eastAsia="zh-CN"/>
               </w:rPr>
               <m:t>ema</m:t>
             </m:r>
@@ -4422,14 +4449,15 @@
       <w:pPr>
         <w:spacing w:after="0" w:line="360" w:lineRule="auto"/>
         <w:ind w:firstLine="420"/>
-      </w:pPr>
-      <w:proofErr w:type="spellStart"/>
-      <w:r>
-        <w:t>窗口缩减</w:t>
-      </w:r>
-      <w:proofErr w:type="spellEnd"/>
-      <w:r>
-        <w:t>：</w:t>
+        <w:rPr>
+          <w:lang w:eastAsia="zh-CN"/>
+        </w:rPr>
+      </w:pPr>
+      <w:r>
+        <w:rPr>
+          <w:lang w:eastAsia="zh-CN"/>
+        </w:rPr>
+        <w:t>窗口缩减：</w:t>
       </w:r>
       <m:oMath>
         <m:sSub>
@@ -4444,6 +4472,7 @@
             <m:r>
               <w:rPr>
                 <w:rFonts w:ascii="Cambria Math" w:hAnsi="Cambria Math"/>
+                <w:lang w:eastAsia="zh-CN"/>
               </w:rPr>
               <m:t>W</m:t>
             </m:r>
@@ -4452,6 +4481,7 @@
             <m:r>
               <w:rPr>
                 <w:rFonts w:ascii="Cambria Math" w:hAnsi="Cambria Math"/>
+                <w:lang w:eastAsia="zh-CN"/>
               </w:rPr>
               <m:t>new</m:t>
             </m:r>
@@ -4460,6 +4490,7 @@
         <m:r>
           <w:rPr>
             <w:rFonts w:ascii="Cambria Math" w:hAnsi="Cambria Math"/>
+            <w:lang w:eastAsia="zh-CN"/>
           </w:rPr>
           <m:t>=</m:t>
         </m:r>
@@ -4478,6 +4509,7 @@
               </m:rPr>
               <w:rPr>
                 <w:rFonts w:ascii="Cambria Math" w:hAnsi="Cambria Math"/>
+                <w:lang w:eastAsia="zh-CN"/>
               </w:rPr>
               <m:t>max</m:t>
             </m:r>
@@ -4495,6 +4527,7 @@
                 <m:r>
                   <w:rPr>
                     <w:rFonts w:ascii="Cambria Math" w:hAnsi="Cambria Math"/>
+                    <w:lang w:eastAsia="zh-CN"/>
                   </w:rPr>
                   <m:t>ρ×</m:t>
                 </m:r>
@@ -4510,6 +4543,7 @@
                     <m:r>
                       <w:rPr>
                         <w:rFonts w:ascii="Cambria Math" w:hAnsi="Cambria Math"/>
+                        <w:lang w:eastAsia="zh-CN"/>
                       </w:rPr>
                       <m:t>W</m:t>
                     </m:r>
@@ -4518,6 +4552,7 @@
                     <m:r>
                       <w:rPr>
                         <w:rFonts w:ascii="Cambria Math" w:hAnsi="Cambria Math"/>
+                        <w:lang w:eastAsia="zh-CN"/>
                       </w:rPr>
                       <m:t>old</m:t>
                     </m:r>
@@ -4526,6 +4561,7 @@
                 <m:r>
                   <w:rPr>
                     <w:rFonts w:ascii="Cambria Math" w:hAnsi="Cambria Math"/>
+                    <w:lang w:eastAsia="zh-CN"/>
                   </w:rPr>
                   <m:t>,</m:t>
                 </m:r>
@@ -4541,6 +4577,7 @@
                     <m:r>
                       <w:rPr>
                         <w:rFonts w:ascii="Cambria Math" w:hAnsi="Cambria Math"/>
+                        <w:lang w:eastAsia="zh-CN"/>
                       </w:rPr>
                       <m:t>W</m:t>
                     </m:r>
@@ -4549,6 +4586,7 @@
                     <m:r>
                       <w:rPr>
                         <w:rFonts w:ascii="Cambria Math" w:hAnsi="Cambria Math"/>
+                        <w:lang w:eastAsia="zh-CN"/>
                       </w:rPr>
                       <m:t>min</m:t>
                     </m:r>
@@ -4560,13 +4598,11 @@
         </m:func>
       </m:oMath>
       <w:r>
-        <w:t>，</w:t>
-      </w:r>
-      <w:proofErr w:type="spellStart"/>
-      <w:r>
-        <w:t>其中</w:t>
-      </w:r>
-      <w:proofErr w:type="spellEnd"/>
+        <w:rPr>
+          <w:lang w:eastAsia="zh-CN"/>
+        </w:rPr>
+        <w:t>，其中</w:t>
+      </w:r>
       <m:oMath>
         <m:sSub>
           <m:sSubPr>
@@ -4580,6 +4616,7 @@
             <m:r>
               <w:rPr>
                 <w:rFonts w:ascii="Cambria Math" w:hAnsi="Cambria Math"/>
+                <w:lang w:eastAsia="zh-CN"/>
               </w:rPr>
               <m:t>W</m:t>
             </m:r>
@@ -4588,6 +4625,7 @@
             <m:r>
               <w:rPr>
                 <w:rFonts w:ascii="Cambria Math" w:hAnsi="Cambria Math"/>
+                <w:lang w:eastAsia="zh-CN"/>
               </w:rPr>
               <m:t>min</m:t>
             </m:r>
@@ -4596,6 +4634,7 @@
         <m:r>
           <w:rPr>
             <w:rFonts w:ascii="Cambria Math" w:hAnsi="Cambria Math"/>
+            <w:lang w:eastAsia="zh-CN"/>
           </w:rPr>
           <m:t>=</m:t>
         </m:r>
@@ -4614,6 +4653,7 @@
               </m:rPr>
               <w:rPr>
                 <w:rFonts w:ascii="Cambria Math" w:hAnsi="Cambria Math"/>
+                <w:lang w:eastAsia="zh-CN"/>
               </w:rPr>
               <m:t>max</m:t>
             </m:r>
@@ -4631,6 +4671,7 @@
                 <m:r>
                   <w:rPr>
                     <w:rFonts w:ascii="Cambria Math" w:hAnsi="Cambria Math"/>
+                    <w:lang w:eastAsia="zh-CN"/>
                   </w:rPr>
                   <m:t>4×MSS,1</m:t>
                 </m:r>
@@ -4640,6 +4681,9 @@
         </m:func>
       </m:oMath>
       <w:r>
+        <w:rPr>
+          <w:lang w:eastAsia="zh-CN"/>
+        </w:rPr>
         <w:t>；</w:t>
       </w:r>
     </w:p>
@@ -5079,6 +5123,7 @@
             <m:r>
               <w:rPr>
                 <w:rFonts w:ascii="Cambria Math" w:hAnsi="Cambria Math"/>
+                <w:lang w:eastAsia="zh-CN"/>
               </w:rPr>
               <m:t>W</m:t>
             </m:r>
@@ -5087,6 +5132,7 @@
             <m:r>
               <w:rPr>
                 <w:rFonts w:ascii="Cambria Math" w:hAnsi="Cambria Math"/>
+                <w:lang w:eastAsia="zh-CN"/>
               </w:rPr>
               <m:t>new</m:t>
             </m:r>
@@ -5095,6 +5141,7 @@
         <m:r>
           <w:rPr>
             <w:rFonts w:ascii="Cambria Math" w:hAnsi="Cambria Math"/>
+            <w:lang w:eastAsia="zh-CN"/>
           </w:rPr>
           <m:t>=</m:t>
         </m:r>
@@ -5113,6 +5160,7 @@
               </m:rPr>
               <w:rPr>
                 <w:rFonts w:ascii="Cambria Math" w:hAnsi="Cambria Math"/>
+                <w:lang w:eastAsia="zh-CN"/>
               </w:rPr>
               <m:t>min</m:t>
             </m:r>
@@ -5130,6 +5178,7 @@
                 <m:r>
                   <w:rPr>
                     <w:rFonts w:ascii="Cambria Math" w:hAnsi="Cambria Math"/>
+                    <w:lang w:eastAsia="zh-CN"/>
                   </w:rPr>
                   <m:t>W+</m:t>
                 </m:r>
@@ -5145,6 +5194,7 @@
                 <m:r>
                   <w:rPr>
                     <w:rFonts w:ascii="Cambria Math" w:hAnsi="Cambria Math"/>
+                    <w:lang w:eastAsia="zh-CN"/>
                   </w:rPr>
                   <m:t>W,</m:t>
                 </m:r>
@@ -5160,6 +5210,7 @@
                     <m:r>
                       <w:rPr>
                         <w:rFonts w:ascii="Cambria Math" w:hAnsi="Cambria Math"/>
+                        <w:lang w:eastAsia="zh-CN"/>
                       </w:rPr>
                       <m:t>W</m:t>
                     </m:r>
@@ -5168,6 +5219,7 @@
                     <m:r>
                       <w:rPr>
                         <w:rFonts w:ascii="Cambria Math" w:hAnsi="Cambria Math"/>
+                        <w:lang w:eastAsia="zh-CN"/>
                       </w:rPr>
                       <m:t>target_ss</m:t>
                     </m:r>
@@ -5449,6 +5501,7 @@
             <m:r>
               <w:rPr>
                 <w:rFonts w:ascii="Cambria Math" w:hAnsi="Cambria Math"/>
+                <w:lang w:eastAsia="zh-CN"/>
               </w:rPr>
               <m:t>W</m:t>
             </m:r>
@@ -5457,6 +5510,7 @@
             <m:r>
               <w:rPr>
                 <w:rFonts w:ascii="Cambria Math" w:hAnsi="Cambria Math"/>
+                <w:lang w:eastAsia="zh-CN"/>
               </w:rPr>
               <m:t>new</m:t>
             </m:r>
@@ -5465,6 +5519,7 @@
         <m:r>
           <w:rPr>
             <w:rFonts w:ascii="Cambria Math" w:hAnsi="Cambria Math"/>
+            <w:lang w:eastAsia="zh-CN"/>
           </w:rPr>
           <m:t>∈</m:t>
         </m:r>
@@ -5491,6 +5546,7 @@
                 <m:r>
                   <w:rPr>
                     <w:rFonts w:ascii="Cambria Math" w:hAnsi="Cambria Math"/>
+                    <w:lang w:eastAsia="zh-CN"/>
                   </w:rPr>
                   <m:t>W</m:t>
                 </m:r>
@@ -5499,6 +5555,7 @@
                 <m:r>
                   <w:rPr>
                     <w:rFonts w:ascii="Cambria Math" w:hAnsi="Cambria Math"/>
+                    <w:lang w:eastAsia="zh-CN"/>
                   </w:rPr>
                   <m:t>min</m:t>
                 </m:r>
@@ -5507,6 +5564,7 @@
             <m:r>
               <w:rPr>
                 <w:rFonts w:ascii="Cambria Math" w:hAnsi="Cambria Math"/>
+                <w:lang w:eastAsia="zh-CN"/>
               </w:rPr>
               <m:t>,</m:t>
             </m:r>
@@ -5522,6 +5580,7 @@
                 <m:r>
                   <w:rPr>
                     <w:rFonts w:ascii="Cambria Math" w:hAnsi="Cambria Math"/>
+                    <w:lang w:eastAsia="zh-CN"/>
                   </w:rPr>
                   <m:t>W</m:t>
                 </m:r>
@@ -5530,6 +5589,7 @@
                 <m:r>
                   <w:rPr>
                     <w:rFonts w:ascii="Cambria Math" w:hAnsi="Cambria Math"/>
+                    <w:lang w:eastAsia="zh-CN"/>
                   </w:rPr>
                   <m:t>max</m:t>
                 </m:r>
@@ -5563,6 +5623,7 @@
             <m:r>
               <w:rPr>
                 <w:rFonts w:ascii="Cambria Math" w:hAnsi="Cambria Math"/>
+                <w:lang w:eastAsia="zh-CN"/>
               </w:rPr>
               <m:t>W</m:t>
             </m:r>
@@ -5571,6 +5632,7 @@
             <m:r>
               <w:rPr>
                 <w:rFonts w:ascii="Cambria Math" w:hAnsi="Cambria Math"/>
+                <w:lang w:eastAsia="zh-CN"/>
               </w:rPr>
               <m:t>max</m:t>
             </m:r>
@@ -7389,6 +7451,7 @@
             <m:r>
               <w:rPr>
                 <w:rFonts w:ascii="Cambria Math" w:hAnsi="Cambria Math"/>
+                <w:lang w:eastAsia="zh-CN"/>
               </w:rPr>
               <m:t>R</m:t>
             </m:r>
@@ -7397,6 +7460,7 @@
             <m:r>
               <w:rPr>
                 <w:rFonts w:ascii="Cambria Math" w:hAnsi="Cambria Math"/>
+                <w:lang w:eastAsia="zh-CN"/>
               </w:rPr>
               <m:t>delivery</m:t>
             </m:r>
@@ -7405,6 +7469,7 @@
         <m:r>
           <w:rPr>
             <w:rFonts w:ascii="Cambria Math" w:hAnsi="Cambria Math"/>
+            <w:lang w:eastAsia="zh-CN"/>
           </w:rPr>
           <m:t>=</m:t>
         </m:r>
@@ -7420,6 +7485,7 @@
             <m:r>
               <w:rPr>
                 <w:rFonts w:ascii="Cambria Math" w:hAnsi="Cambria Math"/>
+                <w:lang w:eastAsia="zh-CN"/>
               </w:rPr>
               <m:t>n</m:t>
             </m:r>
@@ -7428,6 +7494,7 @@
             <m:r>
               <w:rPr>
                 <w:rFonts w:ascii="Cambria Math" w:hAnsi="Cambria Math"/>
+                <w:lang w:eastAsia="zh-CN"/>
               </w:rPr>
               <m:t>ack</m:t>
             </m:r>
@@ -7436,6 +7503,7 @@
         <m:r>
           <w:rPr>
             <w:rFonts w:ascii="Cambria Math" w:hAnsi="Cambria Math"/>
+            <w:lang w:eastAsia="zh-CN"/>
           </w:rPr>
           <m:t>×S/RT</m:t>
         </m:r>
@@ -7451,6 +7519,7 @@
             <m:r>
               <w:rPr>
                 <w:rFonts w:ascii="Cambria Math" w:hAnsi="Cambria Math"/>
+                <w:lang w:eastAsia="zh-CN"/>
               </w:rPr>
               <m:t>T</m:t>
             </m:r>
@@ -7459,6 +7528,7 @@
             <m:r>
               <w:rPr>
                 <w:rFonts w:ascii="Cambria Math" w:hAnsi="Cambria Math"/>
+                <w:lang w:eastAsia="zh-CN"/>
               </w:rPr>
               <m:t>last</m:t>
             </m:r>
@@ -8773,6 +8843,7 @@
             <m:r>
               <w:rPr>
                 <w:rFonts w:ascii="Cambria Math" w:hAnsi="Cambria Math"/>
+                <w:lang w:eastAsia="zh-CN"/>
               </w:rPr>
               <m:t>W</m:t>
             </m:r>
@@ -8781,6 +8852,7 @@
             <m:r>
               <w:rPr>
                 <w:rFonts w:ascii="Cambria Math" w:hAnsi="Cambria Math"/>
+                <w:lang w:eastAsia="zh-CN"/>
               </w:rPr>
               <m:t>new</m:t>
             </m:r>
@@ -9070,17 +9142,29 @@
         <w:t>所示，拥塞控制环境模块实现</w:t>
       </w:r>
       <w:r>
-        <w:t xml:space="preserve"> OpenGym </w:t>
-      </w:r>
+        <w:t xml:space="preserve"> </w:t>
+      </w:r>
+      <w:proofErr w:type="spellStart"/>
+      <w:r>
+        <w:t>OpenGym</w:t>
+      </w:r>
+      <w:proofErr w:type="spellEnd"/>
+      <w:r>
+        <w:t xml:space="preserve"> </w:t>
+      </w:r>
+      <w:proofErr w:type="spellStart"/>
       <w:r>
         <w:t>标准接口，在</w:t>
       </w:r>
+      <w:proofErr w:type="spellEnd"/>
       <w:r>
         <w:t xml:space="preserve"> TCP </w:t>
       </w:r>
+      <w:proofErr w:type="spellStart"/>
       <w:r>
         <w:t>协议栈的</w:t>
       </w:r>
+      <w:proofErr w:type="spellEnd"/>
       <w:r>
         <w:t xml:space="preserve"> 5 </w:t>
       </w:r>
@@ -9169,17 +9253,24 @@
       <w:r>
         <w:t xml:space="preserve"> </w:t>
       </w:r>
+      <w:proofErr w:type="spellStart"/>
       <w:r>
         <w:t>回调更新</w:t>
       </w:r>
+      <w:proofErr w:type="spellEnd"/>
       <w:r>
         <w:t xml:space="preserve"> RTT </w:t>
       </w:r>
+      <w:proofErr w:type="spellStart"/>
       <w:r>
         <w:t>和确认段数；</w:t>
       </w:r>
       <w:r>
-        <w:t xml:space="preserve">CongestionStateSet </w:t>
+        <w:t>CongestionStateSet</w:t>
+      </w:r>
+      <w:proofErr w:type="spellEnd"/>
+      <w:r>
+        <w:t xml:space="preserve"> </w:t>
       </w:r>
       <w:r>
         <w:t>回调记录拥塞算法状态变化；</w:t>
@@ -11005,14 +11096,15 @@
       <w:pPr>
         <w:spacing w:after="0" w:line="360" w:lineRule="auto"/>
         <w:ind w:firstLine="420"/>
-      </w:pPr>
-      <w:proofErr w:type="spellStart"/>
-      <w:r>
-        <w:t>交付速率计算</w:t>
-      </w:r>
-      <w:proofErr w:type="spellEnd"/>
-      <w:r>
-        <w:t>：</w:t>
+        <w:rPr>
+          <w:lang w:eastAsia="zh-CN"/>
+        </w:rPr>
+      </w:pPr>
+      <w:r>
+        <w:rPr>
+          <w:lang w:eastAsia="zh-CN"/>
+        </w:rPr>
+        <w:t>交付速率计算：</w:t>
       </w:r>
       <m:oMath>
         <m:sSub>
@@ -11027,6 +11119,7 @@
             <m:r>
               <w:rPr>
                 <w:rFonts w:ascii="Cambria Math" w:hAnsi="Cambria Math"/>
+                <w:lang w:eastAsia="zh-CN"/>
               </w:rPr>
               <m:t>R</m:t>
             </m:r>
@@ -11035,6 +11128,7 @@
             <m:r>
               <w:rPr>
                 <w:rFonts w:ascii="Cambria Math" w:hAnsi="Cambria Math"/>
+                <w:lang w:eastAsia="zh-CN"/>
               </w:rPr>
               <m:t>delivery</m:t>
             </m:r>
@@ -11043,6 +11137,7 @@
         <m:r>
           <w:rPr>
             <w:rFonts w:ascii="Cambria Math" w:hAnsi="Cambria Math"/>
+            <w:lang w:eastAsia="zh-CN"/>
           </w:rPr>
           <m:t>=</m:t>
         </m:r>
@@ -11058,6 +11153,7 @@
             <m:r>
               <w:rPr>
                 <w:rFonts w:ascii="Cambria Math" w:hAnsi="Cambria Math"/>
+                <w:lang w:eastAsia="zh-CN"/>
               </w:rPr>
               <m:t>n</m:t>
             </m:r>
@@ -11066,6 +11162,7 @@
             <m:r>
               <w:rPr>
                 <w:rFonts w:ascii="Cambria Math" w:hAnsi="Cambria Math"/>
+                <w:lang w:eastAsia="zh-CN"/>
               </w:rPr>
               <m:t>ack</m:t>
             </m:r>
@@ -11074,6 +11171,7 @@
         <m:r>
           <w:rPr>
             <w:rFonts w:ascii="Cambria Math" w:hAnsi="Cambria Math"/>
+            <w:lang w:eastAsia="zh-CN"/>
           </w:rPr>
           <m:t>×S/RT</m:t>
         </m:r>
@@ -11089,6 +11187,7 @@
             <m:r>
               <w:rPr>
                 <w:rFonts w:ascii="Cambria Math" w:hAnsi="Cambria Math"/>
+                <w:lang w:eastAsia="zh-CN"/>
               </w:rPr>
               <m:t>T</m:t>
             </m:r>
@@ -11097,6 +11196,7 @@
             <m:r>
               <w:rPr>
                 <w:rFonts w:ascii="Cambria Math" w:hAnsi="Cambria Math"/>
+                <w:lang w:eastAsia="zh-CN"/>
               </w:rPr>
               <m:t>last</m:t>
             </m:r>
@@ -11104,6 +11204,9 @@
         </m:sSub>
       </m:oMath>
       <w:r>
+        <w:rPr>
+          <w:lang w:eastAsia="zh-CN"/>
+        </w:rPr>
         <w:t>；</w:t>
       </w:r>
     </w:p>
@@ -11111,11 +11214,20 @@
       <w:pPr>
         <w:spacing w:after="0" w:line="360" w:lineRule="auto"/>
         <w:ind w:firstLine="420"/>
-      </w:pPr>
-      <w:r>
+        <w:rPr>
+          <w:lang w:eastAsia="zh-CN"/>
+        </w:rPr>
+      </w:pPr>
+      <w:r>
+        <w:rPr>
+          <w:lang w:eastAsia="zh-CN"/>
+        </w:rPr>
         <w:t>带宽估算：维护长度为</w:t>
       </w:r>
       <w:r>
+        <w:rPr>
+          <w:lang w:eastAsia="zh-CN"/>
+        </w:rPr>
         <w:t xml:space="preserve"> </w:t>
       </w:r>
       <m:oMath>
@@ -11131,6 +11243,7 @@
             <m:r>
               <w:rPr>
                 <w:rFonts w:ascii="Cambria Math" w:hAnsi="Cambria Math"/>
+                <w:lang w:eastAsia="zh-CN"/>
               </w:rPr>
               <m:t>W</m:t>
             </m:r>
@@ -11139,6 +11252,7 @@
             <m:r>
               <w:rPr>
                 <w:rFonts w:ascii="Cambria Math" w:hAnsi="Cambria Math"/>
+                <w:lang w:eastAsia="zh-CN"/>
               </w:rPr>
               <m:t>bw</m:t>
             </m:r>
@@ -11146,9 +11260,15 @@
         </m:sSub>
       </m:oMath>
       <w:r>
+        <w:rPr>
+          <w:lang w:eastAsia="zh-CN"/>
+        </w:rPr>
         <w:t xml:space="preserve"> </w:t>
       </w:r>
       <w:r>
+        <w:rPr>
+          <w:lang w:eastAsia="zh-CN"/>
+        </w:rPr>
         <w:t>的交付速率滑动窗口，取窗口内最大值作为瓶颈带宽估计；</w:t>
       </w:r>
     </w:p>
@@ -11156,20 +11276,28 @@
       <w:pPr>
         <w:spacing w:after="0" w:line="360" w:lineRule="auto"/>
         <w:ind w:firstLine="420"/>
-      </w:pPr>
-      <w:proofErr w:type="spellStart"/>
-      <w:r>
+        <w:rPr>
+          <w:lang w:eastAsia="zh-CN"/>
+        </w:rPr>
+      </w:pPr>
+      <w:r>
+        <w:rPr>
+          <w:lang w:eastAsia="zh-CN"/>
+        </w:rPr>
         <w:t>最小</w:t>
       </w:r>
-      <w:proofErr w:type="spellEnd"/>
-      <w:r>
+      <w:r>
+        <w:rPr>
+          <w:lang w:eastAsia="zh-CN"/>
+        </w:rPr>
         <w:t xml:space="preserve"> RTT </w:t>
       </w:r>
-      <w:proofErr w:type="spellStart"/>
-      <w:r>
+      <w:r>
+        <w:rPr>
+          <w:lang w:eastAsia="zh-CN"/>
+        </w:rPr>
         <w:t>追踪：维护长度为</w:t>
       </w:r>
-      <w:proofErr w:type="spellEnd"/>
       <m:oMath>
         <m:sSub>
           <m:sSubPr>
@@ -11183,6 +11311,7 @@
             <m:r>
               <w:rPr>
                 <w:rFonts w:ascii="Cambria Math" w:hAnsi="Cambria Math"/>
+                <w:lang w:eastAsia="zh-CN"/>
               </w:rPr>
               <m:t>W</m:t>
             </m:r>
@@ -11191,6 +11320,7 @@
             <m:r>
               <w:rPr>
                 <w:rFonts w:ascii="Cambria Math" w:hAnsi="Cambria Math"/>
+                <w:lang w:eastAsia="zh-CN"/>
               </w:rPr>
               <m:t>rtt</m:t>
             </m:r>
@@ -11198,21 +11328,39 @@
         </m:sSub>
       </m:oMath>
       <w:r>
+        <w:rPr>
+          <w:lang w:eastAsia="zh-CN"/>
+        </w:rPr>
         <w:t xml:space="preserve"> </w:t>
       </w:r>
       <w:r>
+        <w:rPr>
+          <w:lang w:eastAsia="zh-CN"/>
+        </w:rPr>
         <w:t>的</w:t>
       </w:r>
       <w:r>
+        <w:rPr>
+          <w:lang w:eastAsia="zh-CN"/>
+        </w:rPr>
         <w:t xml:space="preserve"> RTT </w:t>
       </w:r>
       <w:r>
+        <w:rPr>
+          <w:lang w:eastAsia="zh-CN"/>
+        </w:rPr>
         <w:t>采样滑动窗口，同时追踪全局最小</w:t>
       </w:r>
       <w:r>
+        <w:rPr>
+          <w:lang w:eastAsia="zh-CN"/>
+        </w:rPr>
         <w:t xml:space="preserve"> RTT </w:t>
       </w:r>
       <w:r>
+        <w:rPr>
+          <w:lang w:eastAsia="zh-CN"/>
+        </w:rPr>
         <w:t>值；</w:t>
       </w:r>
     </w:p>
@@ -11386,27 +11534,44 @@
     <w:p>
       <w:pPr>
         <w:spacing w:after="0" w:line="360" w:lineRule="auto"/>
-      </w:pPr>
-      <w:r>
+        <w:rPr>
+          <w:lang w:eastAsia="zh-CN"/>
+        </w:rPr>
+      </w:pPr>
+      <w:r>
+        <w:rPr>
+          <w:lang w:eastAsia="zh-CN"/>
+        </w:rPr>
         <w:t xml:space="preserve">5. </w:t>
       </w:r>
-      <w:proofErr w:type="spellStart"/>
-      <w:r>
+      <w:r>
+        <w:rPr>
+          <w:lang w:eastAsia="zh-CN"/>
+        </w:rPr>
         <w:t>根据权利要求</w:t>
       </w:r>
-      <w:proofErr w:type="spellEnd"/>
-      <w:r>
+      <w:r>
+        <w:rPr>
+          <w:lang w:eastAsia="zh-CN"/>
+        </w:rPr>
         <w:t xml:space="preserve"> 1 </w:t>
       </w:r>
-      <w:proofErr w:type="spellStart"/>
-      <w:r>
+      <w:r>
+        <w:rPr>
+          <w:lang w:eastAsia="zh-CN"/>
+        </w:rPr>
         <w:t>所述的方法，其特征在于，所述步骤</w:t>
       </w:r>
-      <w:proofErr w:type="spellEnd"/>
-      <w:r>
+      <w:r>
+        <w:rPr>
+          <w:lang w:eastAsia="zh-CN"/>
+        </w:rPr>
         <w:t xml:space="preserve"> S5 </w:t>
       </w:r>
       <w:r>
+        <w:rPr>
+          <w:lang w:eastAsia="zh-CN"/>
+        </w:rPr>
         <w:t>中，差异化窗口保留因子包括：</w:t>
       </w:r>
     </w:p>
@@ -11414,11 +11579,20 @@
       <w:pPr>
         <w:spacing w:after="0" w:line="360" w:lineRule="auto"/>
         <w:ind w:firstLine="420"/>
-      </w:pPr>
-      <w:r>
+        <w:rPr>
+          <w:lang w:eastAsia="zh-CN"/>
+        </w:rPr>
+      </w:pPr>
+      <w:r>
+        <w:rPr>
+          <w:lang w:eastAsia="zh-CN"/>
+        </w:rPr>
         <w:t>普通丢包对应窗口保留因子</w:t>
       </w:r>
       <w:r>
+        <w:rPr>
+          <w:lang w:eastAsia="zh-CN"/>
+        </w:rPr>
         <w:t xml:space="preserve"> </w:t>
       </w:r>
       <m:oMath>
@@ -11434,6 +11608,7 @@
             <m:r>
               <w:rPr>
                 <w:rFonts w:ascii="Cambria Math" w:hAnsi="Cambria Math"/>
+                <w:lang w:eastAsia="zh-CN"/>
               </w:rPr>
               <m:t>ρ</m:t>
             </m:r>
@@ -11442,6 +11617,7 @@
             <m:r>
               <w:rPr>
                 <w:rFonts w:ascii="Cambria Math" w:hAnsi="Cambria Math"/>
+                <w:lang w:eastAsia="zh-CN"/>
               </w:rPr>
               <m:t>loss</m:t>
             </m:r>
@@ -11449,6 +11625,9 @@
         </m:sSub>
       </m:oMath>
       <w:r>
+        <w:rPr>
+          <w:lang w:eastAsia="zh-CN"/>
+        </w:rPr>
         <w:t>；</w:t>
       </w:r>
     </w:p>
@@ -11456,14 +11635,26 @@
       <w:pPr>
         <w:spacing w:after="0" w:line="360" w:lineRule="auto"/>
         <w:ind w:firstLine="420"/>
-      </w:pPr>
-      <w:r>
+        <w:rPr>
+          <w:lang w:eastAsia="zh-CN"/>
+        </w:rPr>
+      </w:pPr>
+      <w:r>
+        <w:rPr>
+          <w:lang w:eastAsia="zh-CN"/>
+        </w:rPr>
         <w:t xml:space="preserve">ECN </w:t>
       </w:r>
       <w:r>
+        <w:rPr>
+          <w:lang w:eastAsia="zh-CN"/>
+        </w:rPr>
         <w:t>拥塞通知对应窗口保留因子</w:t>
       </w:r>
       <w:r>
+        <w:rPr>
+          <w:lang w:eastAsia="zh-CN"/>
+        </w:rPr>
         <w:t xml:space="preserve"> </w:t>
       </w:r>
       <m:oMath>
@@ -11479,6 +11670,7 @@
             <m:r>
               <w:rPr>
                 <w:rFonts w:ascii="Cambria Math" w:hAnsi="Cambria Math"/>
+                <w:lang w:eastAsia="zh-CN"/>
               </w:rPr>
               <m:t>ρ</m:t>
             </m:r>
@@ -11487,6 +11679,7 @@
             <m:r>
               <w:rPr>
                 <w:rFonts w:ascii="Cambria Math" w:hAnsi="Cambria Math"/>
+                <w:lang w:eastAsia="zh-CN"/>
               </w:rPr>
               <m:t>ecn</m:t>
             </m:r>
@@ -11494,9 +11687,15 @@
         </m:sSub>
       </m:oMath>
       <w:r>
+        <w:rPr>
+          <w:lang w:eastAsia="zh-CN"/>
+        </w:rPr>
         <w:t>，其中</w:t>
       </w:r>
       <w:r>
+        <w:rPr>
+          <w:lang w:eastAsia="zh-CN"/>
+        </w:rPr>
         <w:t xml:space="preserve"> </w:t>
       </w:r>
       <m:oMath>
@@ -11512,6 +11711,7 @@
             <m:r>
               <w:rPr>
                 <w:rFonts w:ascii="Cambria Math" w:hAnsi="Cambria Math"/>
+                <w:lang w:eastAsia="zh-CN"/>
               </w:rPr>
               <m:t>ρ</m:t>
             </m:r>
@@ -11520,6 +11720,7 @@
             <m:r>
               <w:rPr>
                 <w:rFonts w:ascii="Cambria Math" w:hAnsi="Cambria Math"/>
+                <w:lang w:eastAsia="zh-CN"/>
               </w:rPr>
               <m:t>ecn</m:t>
             </m:r>
@@ -11528,6 +11729,7 @@
         <m:r>
           <w:rPr>
             <w:rFonts w:ascii="Cambria Math" w:hAnsi="Cambria Math"/>
+            <w:lang w:eastAsia="zh-CN"/>
           </w:rPr>
           <m:t>&gt;</m:t>
         </m:r>
@@ -11543,6 +11745,7 @@
             <m:r>
               <w:rPr>
                 <w:rFonts w:ascii="Cambria Math" w:hAnsi="Cambria Math"/>
+                <w:lang w:eastAsia="zh-CN"/>
               </w:rPr>
               <m:t>ρ</m:t>
             </m:r>
@@ -11551,6 +11754,7 @@
             <m:r>
               <w:rPr>
                 <w:rFonts w:ascii="Cambria Math" w:hAnsi="Cambria Math"/>
+                <w:lang w:eastAsia="zh-CN"/>
               </w:rPr>
               <m:t>loss</m:t>
             </m:r>
@@ -11558,6 +11762,9 @@
         </m:sSub>
       </m:oMath>
       <w:r>
+        <w:rPr>
+          <w:lang w:eastAsia="zh-CN"/>
+        </w:rPr>
         <w:t>；</w:t>
       </w:r>
     </w:p>
@@ -11594,6 +11801,7 @@
             <m:r>
               <w:rPr>
                 <w:rFonts w:ascii="Cambria Math" w:hAnsi="Cambria Math"/>
+                <w:lang w:eastAsia="zh-CN"/>
               </w:rPr>
               <m:t>ρ</m:t>
             </m:r>
@@ -11602,6 +11810,7 @@
             <m:r>
               <w:rPr>
                 <w:rFonts w:ascii="Cambria Math" w:hAnsi="Cambria Math"/>
+                <w:lang w:eastAsia="zh-CN"/>
               </w:rPr>
               <m:t>timeout</m:t>
             </m:r>
@@ -11633,6 +11842,7 @@
             <m:r>
               <w:rPr>
                 <w:rFonts w:ascii="Cambria Math" w:hAnsi="Cambria Math"/>
+                <w:lang w:eastAsia="zh-CN"/>
               </w:rPr>
               <m:t>ρ</m:t>
             </m:r>
@@ -11641,6 +11851,7 @@
             <m:r>
               <w:rPr>
                 <w:rFonts w:ascii="Cambria Math" w:hAnsi="Cambria Math"/>
+                <w:lang w:eastAsia="zh-CN"/>
               </w:rPr>
               <m:t>timeout</m:t>
             </m:r>
@@ -11649,6 +11860,7 @@
         <m:r>
           <w:rPr>
             <w:rFonts w:ascii="Cambria Math" w:hAnsi="Cambria Math"/>
+            <w:lang w:eastAsia="zh-CN"/>
           </w:rPr>
           <m:t>&lt;</m:t>
         </m:r>
@@ -11664,6 +11876,7 @@
             <m:r>
               <w:rPr>
                 <w:rFonts w:ascii="Cambria Math" w:hAnsi="Cambria Math"/>
+                <w:lang w:eastAsia="zh-CN"/>
               </w:rPr>
               <m:t>ρ</m:t>
             </m:r>
@@ -11672,6 +11885,7 @@
             <m:r>
               <w:rPr>
                 <w:rFonts w:ascii="Cambria Math" w:hAnsi="Cambria Math"/>
+                <w:lang w:eastAsia="zh-CN"/>
               </w:rPr>
               <m:t>loss</m:t>
             </m:r>
@@ -11805,6 +12019,7 @@
             <m:r>
               <w:rPr>
                 <w:rFonts w:ascii="Cambria Math" w:hAnsi="Cambria Math"/>
+                <w:lang w:eastAsia="zh-CN"/>
               </w:rPr>
               <m:t>D</m:t>
             </m:r>
@@ -11813,6 +12028,7 @@
             <m:r>
               <w:rPr>
                 <w:rFonts w:ascii="Cambria Math" w:hAnsi="Cambria Math"/>
+                <w:lang w:eastAsia="zh-CN"/>
               </w:rPr>
               <m:t>max</m:t>
             </m:r>
@@ -12967,760 +13183,52 @@
     <w:p>
       <w:pPr>
         <w:spacing w:after="0" w:line="360" w:lineRule="auto"/>
-        <w:rPr>
-          <w:lang w:eastAsia="zh-CN"/>
-        </w:rPr>
-      </w:pPr>
-      <w:bookmarkStart w:id="0" w:name="_Hlk234957158"/>
-      <w:r>
-        <w:rPr>
-          <w:sz w:val="18"/>
-          <w:lang w:eastAsia="zh-CN"/>
-        </w:rPr>
-        <w:t>flowchart TD</w:t>
-      </w:r>
-    </w:p>
-    <w:p>
-      <w:pPr>
-        <w:spacing w:after="0" w:line="360" w:lineRule="auto"/>
-        <w:rPr>
-          <w:lang w:eastAsia="zh-CN"/>
-        </w:rPr>
-      </w:pPr>
-      <w:r>
-        <w:rPr>
-          <w:sz w:val="18"/>
-          <w:lang w:eastAsia="zh-CN"/>
-        </w:rPr>
-        <w:t xml:space="preserve">    A[</w:t>
-      </w:r>
-      <w:r>
-        <w:rPr>
-          <w:sz w:val="18"/>
-          <w:lang w:eastAsia="zh-CN"/>
-        </w:rPr>
-        <w:t>开始：</w:t>
-      </w:r>
-      <w:r>
-        <w:rPr>
-          <w:sz w:val="18"/>
-          <w:lang w:eastAsia="zh-CN"/>
-        </w:rPr>
-        <w:t xml:space="preserve">TCP </w:t>
-      </w:r>
-      <w:r>
-        <w:rPr>
-          <w:sz w:val="18"/>
-          <w:lang w:eastAsia="zh-CN"/>
-        </w:rPr>
-        <w:t>连接建立</w:t>
-      </w:r>
-      <w:r>
-        <w:rPr>
-          <w:sz w:val="18"/>
-          <w:lang w:eastAsia="zh-CN"/>
-        </w:rPr>
-        <w:t xml:space="preserve">] --&gt; B[S1 </w:t>
-      </w:r>
-      <w:r>
-        <w:rPr>
-          <w:sz w:val="18"/>
-          <w:lang w:eastAsia="zh-CN"/>
-        </w:rPr>
-        <w:t>构建</w:t>
-      </w:r>
-      <w:r>
-        <w:rPr>
-          <w:sz w:val="18"/>
-          <w:lang w:eastAsia="zh-CN"/>
-        </w:rPr>
-        <w:t xml:space="preserve"> 11 </w:t>
-      </w:r>
-      <w:r>
-        <w:rPr>
-          <w:sz w:val="18"/>
-          <w:lang w:eastAsia="zh-CN"/>
-        </w:rPr>
-        <w:t>维观测空间</w:t>
-      </w:r>
-      <w:r>
-        <w:rPr>
-          <w:sz w:val="18"/>
-          <w:lang w:eastAsia="zh-CN"/>
-        </w:rPr>
-        <w:t>]</w:t>
-      </w:r>
-    </w:p>
-    <w:p>
-      <w:pPr>
-        <w:spacing w:after="0" w:line="360" w:lineRule="auto"/>
-        <w:rPr>
-          <w:lang w:eastAsia="zh-CN"/>
-        </w:rPr>
-      </w:pPr>
-      <w:r>
-        <w:rPr>
-          <w:sz w:val="18"/>
-          <w:lang w:eastAsia="zh-CN"/>
-        </w:rPr>
-        <w:t xml:space="preserve">    B --&gt; B1[</w:t>
-      </w:r>
-      <w:r>
-        <w:rPr>
-          <w:sz w:val="18"/>
-          <w:lang w:eastAsia="zh-CN"/>
-        </w:rPr>
-        <w:t>连接标识</w:t>
-      </w:r>
-      <w:r>
-        <w:rPr>
-          <w:sz w:val="18"/>
-          <w:lang w:eastAsia="zh-CN"/>
-        </w:rPr>
-        <w:t xml:space="preserve"> / </w:t>
-      </w:r>
-      <w:r>
-        <w:rPr>
-          <w:sz w:val="18"/>
-          <w:lang w:eastAsia="zh-CN"/>
-        </w:rPr>
-        <w:t>窗口状态</w:t>
-      </w:r>
-      <w:r>
-        <w:rPr>
-          <w:sz w:val="18"/>
-          <w:lang w:eastAsia="zh-CN"/>
-        </w:rPr>
-        <w:t xml:space="preserve"> / </w:t>
-      </w:r>
-      <w:r>
-        <w:rPr>
-          <w:sz w:val="18"/>
-          <w:lang w:eastAsia="zh-CN"/>
-        </w:rPr>
-        <w:t>传输指标</w:t>
-      </w:r>
-      <w:r>
-        <w:rPr>
-          <w:sz w:val="18"/>
-          <w:lang w:eastAsia="zh-CN"/>
-        </w:rPr>
-        <w:t xml:space="preserve"> / </w:t>
-      </w:r>
-      <w:r>
-        <w:rPr>
-          <w:sz w:val="18"/>
-          <w:lang w:eastAsia="zh-CN"/>
-        </w:rPr>
-        <w:t>延迟测量</w:t>
-      </w:r>
-      <w:r>
-        <w:rPr>
-          <w:sz w:val="18"/>
-          <w:lang w:eastAsia="zh-CN"/>
-        </w:rPr>
-        <w:t xml:space="preserve"> / </w:t>
-      </w:r>
-      <w:r>
-        <w:rPr>
-          <w:sz w:val="18"/>
-          <w:lang w:eastAsia="zh-CN"/>
-        </w:rPr>
-        <w:t>拥塞状态</w:t>
-      </w:r>
-      <w:r>
-        <w:rPr>
-          <w:sz w:val="18"/>
-          <w:lang w:eastAsia="zh-CN"/>
-        </w:rPr>
-        <w:t xml:space="preserve"> / ECN </w:t>
-      </w:r>
-      <w:r>
-        <w:rPr>
-          <w:sz w:val="18"/>
-          <w:lang w:eastAsia="zh-CN"/>
-        </w:rPr>
-        <w:t>状态</w:t>
-      </w:r>
-      <w:r>
-        <w:rPr>
-          <w:sz w:val="18"/>
-          <w:lang w:eastAsia="zh-CN"/>
-        </w:rPr>
-        <w:t>]</w:t>
-      </w:r>
-    </w:p>
-    <w:p>
-      <w:pPr>
-        <w:spacing w:after="0" w:line="360" w:lineRule="auto"/>
-        <w:rPr>
-          <w:lang w:eastAsia="zh-CN"/>
-        </w:rPr>
-      </w:pPr>
-      <w:r>
-        <w:rPr>
-          <w:sz w:val="18"/>
-          <w:lang w:eastAsia="zh-CN"/>
-        </w:rPr>
-        <w:t xml:space="preserve">    B1 --&gt; C[S2 </w:t>
-      </w:r>
-      <w:r>
-        <w:rPr>
-          <w:sz w:val="18"/>
-          <w:lang w:eastAsia="zh-CN"/>
-        </w:rPr>
-        <w:t>多信号融合拥塞检测</w:t>
-      </w:r>
-      <w:r>
-        <w:rPr>
-          <w:sz w:val="18"/>
-          <w:lang w:eastAsia="zh-CN"/>
-        </w:rPr>
-        <w:t>]</w:t>
-      </w:r>
-    </w:p>
-    <w:p>
-      <w:pPr>
-        <w:spacing w:after="0" w:line="360" w:lineRule="auto"/>
-        <w:rPr>
-          <w:lang w:eastAsia="zh-CN"/>
-        </w:rPr>
-      </w:pPr>
-      <w:r>
-        <w:rPr>
-          <w:sz w:val="18"/>
-          <w:lang w:eastAsia="zh-CN"/>
-        </w:rPr>
-        <w:t xml:space="preserve">    C --&gt; C1{</w:t>
-      </w:r>
-      <w:r>
-        <w:rPr>
-          <w:sz w:val="18"/>
-          <w:lang w:eastAsia="zh-CN"/>
-        </w:rPr>
-        <w:t>拥塞类型判定</w:t>
-      </w:r>
-      <w:r>
-        <w:rPr>
-          <w:sz w:val="18"/>
-          <w:lang w:eastAsia="zh-CN"/>
-        </w:rPr>
-        <w:t>}</w:t>
-      </w:r>
-    </w:p>
-    <w:p>
-      <w:pPr>
-        <w:spacing w:after="0" w:line="360" w:lineRule="auto"/>
-      </w:pPr>
-      <w:r>
-        <w:rPr>
-          <w:sz w:val="18"/>
-          <w:lang w:eastAsia="zh-CN"/>
-        </w:rPr>
-        <w:t xml:space="preserve">    </w:t>
-      </w:r>
-      <w:r>
-        <w:rPr>
-          <w:sz w:val="18"/>
-        </w:rPr>
-        <w:t>C1 --&gt;|</w:t>
-      </w:r>
-      <w:proofErr w:type="spellStart"/>
-      <w:r>
-        <w:rPr>
-          <w:sz w:val="18"/>
-        </w:rPr>
-        <w:t>普通丢包</w:t>
-      </w:r>
-      <w:proofErr w:type="spellEnd"/>
-      <w:r>
-        <w:rPr>
-          <w:sz w:val="18"/>
-        </w:rPr>
-        <w:t>| D1[</w:t>
-      </w:r>
-      <w:proofErr w:type="spellStart"/>
-      <w:r>
-        <w:rPr>
-          <w:sz w:val="18"/>
-        </w:rPr>
-        <w:t>ρ_loss</w:t>
-      </w:r>
-      <w:proofErr w:type="spellEnd"/>
-      <w:r>
-        <w:rPr>
-          <w:sz w:val="18"/>
-        </w:rPr>
-        <w:t xml:space="preserve"> = 0.70]</w:t>
-      </w:r>
-    </w:p>
-    <w:p>
-      <w:pPr>
-        <w:spacing w:after="0" w:line="360" w:lineRule="auto"/>
-      </w:pPr>
-      <w:r>
-        <w:rPr>
-          <w:sz w:val="18"/>
-        </w:rPr>
-        <w:t xml:space="preserve">    C1 --&gt;|ECN </w:t>
-      </w:r>
-      <w:r>
-        <w:rPr>
-          <w:sz w:val="18"/>
-        </w:rPr>
-        <w:t>标记</w:t>
-      </w:r>
-      <w:r>
-        <w:rPr>
-          <w:sz w:val="18"/>
-        </w:rPr>
-        <w:t>| D2[ρ_ecn = 0.75]</w:t>
-      </w:r>
-    </w:p>
-    <w:p>
-      <w:pPr>
-        <w:spacing w:after="0" w:line="360" w:lineRule="auto"/>
-      </w:pPr>
-      <w:r>
-        <w:rPr>
-          <w:sz w:val="18"/>
-        </w:rPr>
-        <w:t xml:space="preserve">    C1 --&gt;|</w:t>
-      </w:r>
-      <w:r>
-        <w:rPr>
-          <w:sz w:val="18"/>
-        </w:rPr>
-        <w:t>超时丢包</w:t>
-      </w:r>
-      <w:r>
-        <w:rPr>
-          <w:sz w:val="18"/>
-        </w:rPr>
-        <w:t>| D3[ρ_timeout = 0.50]</w:t>
-      </w:r>
-    </w:p>
-    <w:p>
-      <w:pPr>
-        <w:spacing w:after="0" w:line="360" w:lineRule="auto"/>
-      </w:pPr>
-      <w:r>
-        <w:rPr>
-          <w:sz w:val="18"/>
-        </w:rPr>
-        <w:t xml:space="preserve">    C1 --&gt;|</w:t>
-      </w:r>
-      <w:r>
-        <w:rPr>
-          <w:sz w:val="18"/>
-        </w:rPr>
-        <w:t>无拥塞</w:t>
-      </w:r>
-      <w:r>
-        <w:rPr>
-          <w:sz w:val="18"/>
-        </w:rPr>
-        <w:t xml:space="preserve">| E[S3 BDP </w:t>
-      </w:r>
-      <w:r>
-        <w:rPr>
-          <w:sz w:val="18"/>
-        </w:rPr>
-        <w:t>估算</w:t>
-      </w:r>
-      <w:r>
-        <w:rPr>
-          <w:sz w:val="18"/>
-        </w:rPr>
-        <w:t>]</w:t>
-      </w:r>
-    </w:p>
-    <w:p>
-      <w:pPr>
-        <w:spacing w:after="0" w:line="360" w:lineRule="auto"/>
-      </w:pPr>
-      <w:r>
-        <w:rPr>
-          <w:sz w:val="18"/>
-        </w:rPr>
-        <w:t xml:space="preserve">    E --&gt; E1["BDP = B_hat × RTT_min&lt;br/&gt;</w:t>
-      </w:r>
-      <w:r>
-        <w:rPr>
-          <w:sz w:val="18"/>
-        </w:rPr>
-        <w:t>带宽窗口</w:t>
-      </w:r>
-      <w:r>
-        <w:rPr>
-          <w:sz w:val="18"/>
-        </w:rPr>
-        <w:t xml:space="preserve"> W_bw=40&lt;br/&gt;RTT </w:t>
-      </w:r>
-      <w:r>
-        <w:rPr>
-          <w:sz w:val="18"/>
-        </w:rPr>
-        <w:t>窗口</w:t>
-      </w:r>
-      <w:r>
-        <w:rPr>
-          <w:sz w:val="18"/>
-        </w:rPr>
-        <w:t xml:space="preserve"> W_rtt=40"]</w:t>
-      </w:r>
-    </w:p>
-    <w:p>
-      <w:pPr>
-        <w:spacing w:after="0" w:line="360" w:lineRule="auto"/>
-      </w:pPr>
-      <w:r>
-        <w:rPr>
-          <w:sz w:val="18"/>
-        </w:rPr>
-        <w:t xml:space="preserve">    E1 --&gt; F[S4 </w:t>
-      </w:r>
-      <w:r>
-        <w:rPr>
-          <w:sz w:val="18"/>
-        </w:rPr>
-        <w:t>自适应参数调优</w:t>
-      </w:r>
-      <w:r>
-        <w:rPr>
-          <w:sz w:val="18"/>
-        </w:rPr>
-        <w:t>]</w:t>
-      </w:r>
-    </w:p>
-    <w:p>
-      <w:pPr>
-        <w:spacing w:after="0" w:line="360" w:lineRule="auto"/>
-        <w:rPr>
-          <w:lang w:eastAsia="zh-CN"/>
-        </w:rPr>
-      </w:pPr>
-      <w:r>
-        <w:rPr>
-          <w:sz w:val="18"/>
-        </w:rPr>
-        <w:t xml:space="preserve">    </w:t>
-      </w:r>
-      <w:r>
-        <w:rPr>
-          <w:sz w:val="18"/>
-          <w:lang w:eastAsia="zh-CN"/>
-        </w:rPr>
-        <w:t>F --&gt; F1["</w:t>
-      </w:r>
-      <w:r>
-        <w:rPr>
-          <w:sz w:val="18"/>
-          <w:lang w:eastAsia="zh-CN"/>
-        </w:rPr>
-        <w:t>路径感知</w:t>
-      </w:r>
-      <w:r>
-        <w:rPr>
-          <w:sz w:val="18"/>
-          <w:lang w:eastAsia="zh-CN"/>
-        </w:rPr>
-        <w:t xml:space="preserve"> RTT </w:t>
-      </w:r>
-      <w:r>
-        <w:rPr>
-          <w:sz w:val="18"/>
-          <w:lang w:eastAsia="zh-CN"/>
-        </w:rPr>
-        <w:t>膨胀调节</w:t>
-      </w:r>
-      <w:r>
-        <w:rPr>
-          <w:sz w:val="18"/>
-          <w:lang w:eastAsia="zh-CN"/>
-        </w:rPr>
-        <w:t>&lt;</w:t>
-      </w:r>
-      <w:proofErr w:type="spellStart"/>
-      <w:r>
-        <w:rPr>
-          <w:sz w:val="18"/>
-          <w:lang w:eastAsia="zh-CN"/>
-        </w:rPr>
-        <w:t>br</w:t>
-      </w:r>
-      <w:proofErr w:type="spellEnd"/>
-      <w:r>
-        <w:rPr>
-          <w:sz w:val="18"/>
-          <w:lang w:eastAsia="zh-CN"/>
-        </w:rPr>
-        <w:t>/&gt;</w:t>
-      </w:r>
-      <w:r>
-        <w:rPr>
-          <w:sz w:val="18"/>
-        </w:rPr>
-        <w:t>α</w:t>
-      </w:r>
-      <w:r>
-        <w:rPr>
-          <w:sz w:val="18"/>
-          <w:lang w:eastAsia="zh-CN"/>
-        </w:rPr>
-        <w:t xml:space="preserve"> ∈ [0.85, 1.30]"]</w:t>
-      </w:r>
-    </w:p>
-    <w:p>
-      <w:pPr>
-        <w:spacing w:after="0" w:line="360" w:lineRule="auto"/>
-      </w:pPr>
-      <w:r>
-        <w:rPr>
-          <w:sz w:val="18"/>
-          <w:lang w:eastAsia="zh-CN"/>
-        </w:rPr>
-        <w:t xml:space="preserve">    </w:t>
-      </w:r>
-      <w:r>
-        <w:rPr>
-          <w:sz w:val="18"/>
-        </w:rPr>
-        <w:t xml:space="preserve">F1 --&gt; </w:t>
-      </w:r>
-      <w:proofErr w:type="gramStart"/>
-      <w:r>
-        <w:rPr>
-          <w:sz w:val="18"/>
-        </w:rPr>
-        <w:t>G[</w:t>
-      </w:r>
-      <w:proofErr w:type="gramEnd"/>
-      <w:r>
-        <w:rPr>
-          <w:sz w:val="18"/>
-        </w:rPr>
-        <w:t xml:space="preserve">S5 </w:t>
-      </w:r>
-      <w:proofErr w:type="spellStart"/>
-      <w:r>
-        <w:rPr>
-          <w:sz w:val="18"/>
-        </w:rPr>
-        <w:t>融合控制策略</w:t>
-      </w:r>
-      <w:proofErr w:type="spellEnd"/>
-      <w:r>
-        <w:rPr>
-          <w:sz w:val="18"/>
-        </w:rPr>
-        <w:t>]</w:t>
-      </w:r>
-    </w:p>
-    <w:p>
-      <w:pPr>
-        <w:spacing w:after="0" w:line="360" w:lineRule="auto"/>
-      </w:pPr>
-      <w:r>
-        <w:rPr>
-          <w:sz w:val="18"/>
-        </w:rPr>
-        <w:t xml:space="preserve">    G --&gt; G1["</w:t>
-      </w:r>
-      <w:r>
-        <w:rPr>
-          <w:sz w:val="18"/>
-        </w:rPr>
-        <w:t>目标窗口参考</w:t>
-      </w:r>
-      <w:r>
-        <w:rPr>
-          <w:sz w:val="18"/>
-        </w:rPr>
-        <w:t xml:space="preserve"> α×BDP&lt;br/&gt;γ=1.0 </w:t>
-      </w:r>
-      <w:r>
-        <w:rPr>
-          <w:sz w:val="18"/>
-        </w:rPr>
-        <w:t>的加性调节</w:t>
-      </w:r>
-      <w:r>
-        <w:rPr>
-          <w:sz w:val="18"/>
-        </w:rPr>
-        <w:t>"]</w:t>
-      </w:r>
-    </w:p>
-    <w:p>
-      <w:pPr>
-        <w:spacing w:after="0" w:line="360" w:lineRule="auto"/>
-      </w:pPr>
-      <w:r>
-        <w:rPr>
-          <w:sz w:val="18"/>
-        </w:rPr>
-        <w:t xml:space="preserve">    G1 --&gt; H[S6 </w:t>
-      </w:r>
-      <w:r>
-        <w:rPr>
-          <w:sz w:val="18"/>
-        </w:rPr>
-        <w:t>动作执行：更新</w:t>
-      </w:r>
-      <w:r>
-        <w:rPr>
-          <w:sz w:val="18"/>
-        </w:rPr>
-        <w:t xml:space="preserve"> cwnd / ssthresh]</w:t>
-      </w:r>
-    </w:p>
-    <w:p>
-      <w:pPr>
-        <w:spacing w:after="0" w:line="360" w:lineRule="auto"/>
-      </w:pPr>
-      <w:r>
-        <w:rPr>
-          <w:sz w:val="18"/>
-        </w:rPr>
-        <w:t xml:space="preserve">    D1 --&gt; I[S5b </w:t>
-      </w:r>
-      <w:r>
-        <w:rPr>
-          <w:sz w:val="18"/>
-        </w:rPr>
-        <w:t>差异化窗口缩减</w:t>
-      </w:r>
-      <w:r>
-        <w:rPr>
-          <w:sz w:val="18"/>
-        </w:rPr>
-        <w:t>]</w:t>
-      </w:r>
-    </w:p>
-    <w:p>
-      <w:pPr>
-        <w:spacing w:after="0" w:line="360" w:lineRule="auto"/>
-      </w:pPr>
-      <w:r>
-        <w:rPr>
-          <w:sz w:val="18"/>
-        </w:rPr>
-        <w:t xml:space="preserve">    D2 --&gt; I</w:t>
-      </w:r>
-    </w:p>
-    <w:p>
-      <w:pPr>
-        <w:spacing w:after="0" w:line="360" w:lineRule="auto"/>
-      </w:pPr>
-      <w:r>
-        <w:rPr>
-          <w:sz w:val="18"/>
-        </w:rPr>
-        <w:t xml:space="preserve">    D3 --&gt; I</w:t>
-      </w:r>
-    </w:p>
-    <w:p>
-      <w:pPr>
-        <w:spacing w:after="0" w:line="360" w:lineRule="auto"/>
-      </w:pPr>
-      <w:r>
-        <w:rPr>
-          <w:sz w:val="18"/>
-        </w:rPr>
-        <w:t xml:space="preserve">    I --&gt; I1["W_new = ρ × W&lt;br/&gt;</w:t>
-      </w:r>
-      <w:r>
-        <w:rPr>
-          <w:sz w:val="18"/>
-        </w:rPr>
-        <w:t>连续缩减保护</w:t>
-      </w:r>
-      <w:r>
-        <w:rPr>
-          <w:sz w:val="18"/>
-        </w:rPr>
-        <w:t xml:space="preserve"> D_max = 3"]</w:t>
-      </w:r>
-    </w:p>
-    <w:p>
-      <w:pPr>
-        <w:spacing w:after="0" w:line="360" w:lineRule="auto"/>
-      </w:pPr>
-      <w:r>
-        <w:rPr>
-          <w:sz w:val="18"/>
-        </w:rPr>
-        <w:t xml:space="preserve">    I1 --&gt; H</w:t>
-      </w:r>
-    </w:p>
-    <w:p>
-      <w:pPr>
-        <w:spacing w:after="0" w:line="360" w:lineRule="auto"/>
-        <w:rPr>
-          <w:lang w:eastAsia="zh-CN"/>
-        </w:rPr>
-      </w:pPr>
-      <w:r>
-        <w:rPr>
-          <w:sz w:val="18"/>
-        </w:rPr>
-        <w:t xml:space="preserve">    </w:t>
-      </w:r>
-      <w:r>
-        <w:rPr>
-          <w:sz w:val="18"/>
-          <w:lang w:eastAsia="zh-CN"/>
-        </w:rPr>
-        <w:t>H --&gt; J[</w:t>
-      </w:r>
-      <w:r>
-        <w:rPr>
-          <w:sz w:val="18"/>
-          <w:lang w:eastAsia="zh-CN"/>
-        </w:rPr>
-        <w:t>强化学习反馈：奖励信号</w:t>
-      </w:r>
-      <w:r>
-        <w:rPr>
-          <w:sz w:val="18"/>
-          <w:lang w:eastAsia="zh-CN"/>
-        </w:rPr>
-        <w:t xml:space="preserve"> EMA </w:t>
-      </w:r>
-      <w:r>
-        <w:rPr>
-          <w:sz w:val="18"/>
-          <w:lang w:eastAsia="zh-CN"/>
-        </w:rPr>
-        <w:t>更新</w:t>
-      </w:r>
-      <w:r>
-        <w:rPr>
-          <w:sz w:val="18"/>
-          <w:lang w:eastAsia="zh-CN"/>
-        </w:rPr>
-        <w:t>]</w:t>
-      </w:r>
-    </w:p>
-    <w:p>
-      <w:pPr>
-        <w:spacing w:after="0" w:line="360" w:lineRule="auto"/>
-      </w:pPr>
-      <w:r>
-        <w:rPr>
-          <w:sz w:val="18"/>
-          <w:lang w:eastAsia="zh-CN"/>
-        </w:rPr>
-        <w:t xml:space="preserve">    </w:t>
-      </w:r>
-      <w:r>
-        <w:rPr>
-          <w:sz w:val="18"/>
-        </w:rPr>
-        <w:t>J --&gt; B</w:t>
-      </w:r>
-      <w:bookmarkEnd w:id="0"/>
+        <w:jc w:val="center"/>
+        <w:rPr>
+          <w:lang w:eastAsia="zh-CN"/>
+        </w:rPr>
+      </w:pPr>
+      <w:r>
+        <w:rPr>
+          <w:noProof/>
+          <w:lang w:eastAsia="zh-CN"/>
+        </w:rPr>
+        <w:drawing>
+          <wp:inline distT="0" distB="0" distL="0" distR="0" wp14:anchorId="7D825089" wp14:editId="439CB1A0">
+            <wp:extent cx="4118510" cy="7611036"/>
+            <wp:effectExtent l="0" t="0" r="0" b="0"/>
+            <wp:docPr id="366720488" name="图片 1"/>
+            <wp:cNvGraphicFramePr>
+              <a:graphicFrameLocks xmlns:a="http://schemas.openxmlformats.org/drawingml/2006/main" noChangeAspect="1"/>
+            </wp:cNvGraphicFramePr>
+            <a:graphic xmlns:a="http://schemas.openxmlformats.org/drawingml/2006/main">
+              <a:graphicData uri="http://schemas.openxmlformats.org/drawingml/2006/picture">
+                <pic:pic xmlns:pic="http://schemas.openxmlformats.org/drawingml/2006/picture">
+                  <pic:nvPicPr>
+                    <pic:cNvPr id="366720488" name="图片 366720488"/>
+                    <pic:cNvPicPr/>
+                  </pic:nvPicPr>
+                  <pic:blipFill>
+                    <a:blip r:embed="rId6"/>
+                    <a:stretch>
+                      <a:fillRect/>
+                    </a:stretch>
+                  </pic:blipFill>
+                  <pic:spPr>
+                    <a:xfrm>
+                      <a:off x="0" y="0"/>
+                      <a:ext cx="4130906" cy="7633943"/>
+                    </a:xfrm>
+                    <a:prstGeom prst="rect">
+                      <a:avLst/>
+                    </a:prstGeom>
+                  </pic:spPr>
+                </pic:pic>
+              </a:graphicData>
+            </a:graphic>
+          </wp:inline>
+        </w:drawing>
+      </w:r>
     </w:p>
     <w:sectPr>
       <w:pgSz w:w="11906" w:h="16838"/>

</xml_diff>